<commit_message>
update to Matthew's research for licensing information
</commit_message>
<xml_diff>
--- a/MatthewResearch.docx
+++ b/MatthewResearch.docx
@@ -458,6 +458,9 @@
     </w:p>
     <w:p>
       <w:r>
+        <w:rPr>
+          <w:noProof/>
+        </w:rPr>
         <w:drawing>
           <wp:inline distT="0" distB="0" distL="0" distR="0" wp14:anchorId="5A6358D5" wp14:editId="44DE71B8">
             <wp:extent cx="5715000" cy="3810000"/>
@@ -633,6 +636,411 @@
       </w:r>
     </w:p>
     <w:p/>
+    <w:p>
+      <w:pPr>
+        <w:rPr>
+          <w:b/>
+          <w:bCs/>
+          <w:sz w:val="32"/>
+          <w:szCs w:val="32"/>
+        </w:rPr>
+      </w:pPr>
+      <w:r>
+        <w:rPr>
+          <w:b/>
+          <w:bCs/>
+          <w:sz w:val="32"/>
+          <w:szCs w:val="32"/>
+        </w:rPr>
+        <w:t>Source:</w:t>
+      </w:r>
+      <w:r>
+        <w:rPr>
+          <w:b/>
+          <w:bCs/>
+          <w:sz w:val="32"/>
+          <w:szCs w:val="32"/>
+        </w:rPr>
+        <w:t xml:space="preserve"> </w:t>
+      </w:r>
+      <w:hyperlink r:id="rId13" w:history="1">
+        <w:r>
+          <w:rPr>
+            <w:rStyle w:val="Hyperlink"/>
+            <w:b/>
+            <w:bCs/>
+            <w:sz w:val="32"/>
+            <w:szCs w:val="32"/>
+          </w:rPr>
+          <w:t>https://solutionshub.epam.com/blog/post/open-source-licenses-definition-types-and-comparison</w:t>
+        </w:r>
+      </w:hyperlink>
+    </w:p>
+    <w:p>
+      <w:pPr>
+        <w:rPr>
+          <w:b/>
+          <w:bCs/>
+        </w:rPr>
+      </w:pPr>
+      <w:r>
+        <w:rPr>
+          <w:b/>
+          <w:bCs/>
+        </w:rPr>
+        <w:t>What is an Open-Source License?</w:t>
+      </w:r>
+    </w:p>
+    <w:p>
+      <w:r>
+        <w:t xml:space="preserve">Open-source software license definition says that these are legal agreements that determine the rules under which users can access and modify the code of open-source software. These licenses typically allow users to use, change, and distribute the software freely, </w:t>
+      </w:r>
+      <w:proofErr w:type="gramStart"/>
+      <w:r>
+        <w:t>as long as</w:t>
+      </w:r>
+      <w:proofErr w:type="gramEnd"/>
+      <w:r>
+        <w:t xml:space="preserve"> they follow certain conditions outlined in the license.</w:t>
+      </w:r>
+    </w:p>
+    <w:p>
+      <w:r>
+        <w:t>Open-source software licenses provide a legal framework that protects both the rights of the software creators and the users. In simple terms, they are like rules for using and sharing free software.</w:t>
+      </w:r>
+    </w:p>
+    <w:p>
+      <w:pPr>
+        <w:rPr>
+          <w:b/>
+          <w:bCs/>
+        </w:rPr>
+      </w:pPr>
+      <w:r>
+        <w:rPr>
+          <w:b/>
+          <w:bCs/>
+        </w:rPr>
+        <w:t>Open-Source Definition</w:t>
+      </w:r>
+    </w:p>
+    <w:p>
+      <w:r>
+        <w:t xml:space="preserve">To make sure that open-source software licenses are clear, let's go one step back to briefly describe </w:t>
+      </w:r>
+      <w:hyperlink r:id="rId14" w:history="1">
+        <w:r>
+          <w:rPr>
+            <w:rStyle w:val="Hyperlink"/>
+            <w:b/>
+            <w:bCs/>
+          </w:rPr>
+          <w:t>open-source meaning in general</w:t>
+        </w:r>
+      </w:hyperlink>
+      <w:r>
+        <w:t>.</w:t>
+      </w:r>
+    </w:p>
+    <w:p>
+      <w:r>
+        <w:t xml:space="preserve">The main distinction can be made between open-source and proprietary software. With proprietary software, only the company that owns it has access to the source code and can see and modify it. It is protected by a proprietary software license. On the contrary, open-source code is publicly accessible and distributed along with the software. It is made </w:t>
+      </w:r>
+      <w:r>
+        <w:lastRenderedPageBreak/>
+        <w:t>available to everyone and can be modified and improved by anyone with the necessary skills. The idea behind open source is to promote collaboration and innovation in software development.</w:t>
+      </w:r>
+    </w:p>
+    <w:p>
+      <w:pPr>
+        <w:rPr>
+          <w:b/>
+          <w:bCs/>
+        </w:rPr>
+      </w:pPr>
+      <w:r>
+        <w:rPr>
+          <w:b/>
+          <w:bCs/>
+        </w:rPr>
+        <w:t>What's the Difference Between Open-Source and Public Domain?</w:t>
+      </w:r>
+    </w:p>
+    <w:p>
+      <w:r>
+        <w:t>Before diving any deeper into open-source licenses, let's make one more distinction clear - the one between open-source and public domain. These are two concepts related to the distribution and usage of software and other works.</w:t>
+      </w:r>
+    </w:p>
+    <w:p>
+      <w:r>
+        <w:rPr>
+          <w:b/>
+          <w:bCs/>
+        </w:rPr>
+        <w:t>Open-source</w:t>
+      </w:r>
+      <w:r>
+        <w:t xml:space="preserve"> refers to software or other works that have an open-source license, which allows for free use, modification, and distribution. The license sets specific rules for usage and distribution but encourages collaboration and sharing of the work.</w:t>
+      </w:r>
+    </w:p>
+    <w:p>
+      <w:r>
+        <w:rPr>
+          <w:b/>
+          <w:bCs/>
+        </w:rPr>
+        <w:t>Public domain</w:t>
+      </w:r>
+      <w:r>
+        <w:t xml:space="preserve"> includes works that are not restricted by copyright and can be used, modified, and distributed without restriction. This can happen when a copyright has expired or when the creator chooses to give up their rights to the work.</w:t>
+      </w:r>
+    </w:p>
+    <w:p>
+      <w:r>
+        <w:t xml:space="preserve">The main difference between the two is that </w:t>
+      </w:r>
+      <w:proofErr w:type="gramStart"/>
+      <w:r>
+        <w:t>open-source</w:t>
+      </w:r>
+      <w:proofErr w:type="gramEnd"/>
+      <w:r>
+        <w:t xml:space="preserve"> has a license that sets rules for usage, while public domain has no restrictions at all. Both concepts promote sharing and collaboration, but open source provides a more structured framework for it.</w:t>
+      </w:r>
+    </w:p>
+    <w:p>
+      <w:pPr>
+        <w:rPr>
+          <w:b/>
+          <w:bCs/>
+        </w:rPr>
+      </w:pPr>
+      <w:r>
+        <w:rPr>
+          <w:b/>
+          <w:bCs/>
+        </w:rPr>
+        <w:t>Two Main Open-Source License Categories: Copyleft and Permissive</w:t>
+      </w:r>
+    </w:p>
+    <w:p>
+      <w:r>
+        <w:t xml:space="preserve">Based on the obligations and limitations imposed on users by the license, there are two main open-source license categories - </w:t>
+      </w:r>
+      <w:r>
+        <w:rPr>
+          <w:b/>
+          <w:bCs/>
+        </w:rPr>
+        <w:t>copyleft</w:t>
+      </w:r>
+      <w:r>
+        <w:t xml:space="preserve"> and </w:t>
+      </w:r>
+      <w:r>
+        <w:rPr>
+          <w:b/>
+          <w:bCs/>
+        </w:rPr>
+        <w:t>permissive licenses</w:t>
+      </w:r>
+      <w:r>
+        <w:t>.</w:t>
+      </w:r>
+    </w:p>
+    <w:p>
+      <w:pPr>
+        <w:rPr>
+          <w:b/>
+          <w:bCs/>
+        </w:rPr>
+      </w:pPr>
+      <w:r>
+        <w:rPr>
+          <w:b/>
+          <w:bCs/>
+        </w:rPr>
+        <w:t xml:space="preserve">Copyleft? You Mean Copyright, </w:t>
+      </w:r>
+      <w:proofErr w:type="gramStart"/>
+      <w:r>
+        <w:rPr>
+          <w:b/>
+          <w:bCs/>
+        </w:rPr>
+        <w:t>Right</w:t>
+      </w:r>
+      <w:proofErr w:type="gramEnd"/>
+      <w:r>
+        <w:rPr>
+          <w:b/>
+          <w:bCs/>
+        </w:rPr>
+        <w:t>?</w:t>
+      </w:r>
+    </w:p>
+    <w:p>
+      <w:proofErr w:type="gramStart"/>
+      <w:r>
+        <w:t>Actually, copyleft</w:t>
+      </w:r>
+      <w:proofErr w:type="gramEnd"/>
+      <w:r>
+        <w:t xml:space="preserve"> does exist, and as you can guess it is the opposite of copyright. While copyright restricts the use and distribution of a work, copyleft licenses allow that </w:t>
+      </w:r>
+      <w:proofErr w:type="gramStart"/>
+      <w:r>
+        <w:t>as long as</w:t>
+      </w:r>
+      <w:proofErr w:type="gramEnd"/>
+      <w:r>
+        <w:t xml:space="preserve"> the terms stated are obeyed.</w:t>
+      </w:r>
+    </w:p>
+    <w:p>
+      <w:r>
+        <w:t>Imagine you wrote a cookbook and you have the copyright to the book. This means that only you have the exclusive right to use, sell, and distribute the book. No one else can sell or distribute copies of your book without your permission.</w:t>
+      </w:r>
+    </w:p>
+    <w:p>
+      <w:r>
+        <w:t xml:space="preserve">Now, imagine that you wrote an open-source cookbook and released it under a copyleft license. This means that anyone can use, modify, and distribute the book for free, </w:t>
+      </w:r>
+      <w:proofErr w:type="gramStart"/>
+      <w:r>
+        <w:t>as long as</w:t>
+      </w:r>
+      <w:proofErr w:type="gramEnd"/>
+      <w:r>
+        <w:t xml:space="preserve"> they also share their modifications and any derivative works under the same copyleft license. In this case, the book becomes a collaborative effort, with everyone adding and improving the recipes. The goal of copyleft is to ensure that the book remains freely available and that future modifications are also freely available.</w:t>
+      </w:r>
+    </w:p>
+    <w:p>
+      <w:r>
+        <w:lastRenderedPageBreak/>
+        <w:t>As explained in this example, copyright gives the creator control over their work, while copyleft encourages collaboration and sharing. Let's have a closer look at each of them.</w:t>
+      </w:r>
+    </w:p>
+    <w:p>
+      <w:pPr>
+        <w:rPr>
+          <w:b/>
+          <w:bCs/>
+        </w:rPr>
+      </w:pPr>
+      <w:r>
+        <w:rPr>
+          <w:b/>
+          <w:bCs/>
+        </w:rPr>
+        <w:t>Copyleft Definition</w:t>
+      </w:r>
+    </w:p>
+    <w:p>
+      <w:r>
+        <w:t xml:space="preserve">Open-source software licenses in this category allow for the free distribution and modification of a work, </w:t>
+      </w:r>
+      <w:proofErr w:type="gramStart"/>
+      <w:r>
+        <w:t>as long as</w:t>
+      </w:r>
+      <w:proofErr w:type="gramEnd"/>
+      <w:r>
+        <w:t xml:space="preserve"> any derivative works are also licensed under the identical license. It is meant to ensure that the work remains open and freely available for future use, modification, and distribution. To put it another way, your modifications must remain just as open and accessible to everyone with identical rights and privileges afforded by the initial version.</w:t>
+      </w:r>
+    </w:p>
+    <w:p>
+      <w:r>
+        <w:t>These open-source software licenses can be further divided into:</w:t>
+      </w:r>
+    </w:p>
+    <w:p>
+      <w:pPr>
+        <w:rPr>
+          <w:b/>
+          <w:bCs/>
+        </w:rPr>
+      </w:pPr>
+      <w:r>
+        <w:rPr>
+          <w:b/>
+          <w:bCs/>
+        </w:rPr>
+        <w:t>1. Strong Copyleft Licenses</w:t>
+      </w:r>
+    </w:p>
+    <w:p>
+      <w:r>
+        <w:t xml:space="preserve">If a source code is protected by a strong copyleft license, then the derivative software needs to be publicly available under that license as well. This includes all linked libraries and components within the software. For example, if someone modifies and distributes software under a GPL license, they must also make the source code available and license their modifications under the same GPL license. </w:t>
+      </w:r>
+      <w:proofErr w:type="gramStart"/>
+      <w:r>
+        <w:t>So</w:t>
+      </w:r>
+      <w:proofErr w:type="gramEnd"/>
+      <w:r>
+        <w:t xml:space="preserve"> if you plan to develop software and offer it as proprietary, these are open-source licenses to avoid.</w:t>
+      </w:r>
+    </w:p>
+    <w:p>
+      <w:pPr>
+        <w:rPr>
+          <w:b/>
+          <w:bCs/>
+        </w:rPr>
+      </w:pPr>
+      <w:r>
+        <w:rPr>
+          <w:b/>
+          <w:bCs/>
+        </w:rPr>
+        <w:t>2. Weak Copyleft Licenses</w:t>
+      </w:r>
+    </w:p>
+    <w:p>
+      <w:r>
+        <w:t xml:space="preserve">The requirements of a weak copyleft license are </w:t>
+      </w:r>
+      <w:proofErr w:type="gramStart"/>
+      <w:r>
+        <w:t>similar to</w:t>
+      </w:r>
+      <w:proofErr w:type="gramEnd"/>
+      <w:r>
+        <w:t xml:space="preserve"> those of a strong one, but they apply to a limited set of code. This open-source license only requires that the source code of the original or modified work be made publicly available, while the rest of the code used together with the work doesn't have to be published under the same license.</w:t>
+      </w:r>
+    </w:p>
+    <w:p>
+      <w:pPr>
+        <w:rPr>
+          <w:b/>
+          <w:bCs/>
+        </w:rPr>
+      </w:pPr>
+      <w:r>
+        <w:rPr>
+          <w:b/>
+          <w:bCs/>
+        </w:rPr>
+        <w:t>Permissive Licenses</w:t>
+      </w:r>
+    </w:p>
+    <w:p>
+      <w:r>
+        <w:t>Permissive open-source licenses are a type of open-source license that allows for greater flexibility in the use and distribution of open-source software. Permissive licenses, such as the MIT License and the BSD License, place minimal restrictions on the use, modification, and distribution of the software.</w:t>
+      </w:r>
+    </w:p>
+    <w:p>
+      <w:r>
+        <w:t>With permissive licenses, users are free to use the software for any purpose, including commercial purposes, and are not required to release the source code or license their modifications under the same terms. This allows for greater flexibility in the use and distribution of the software, but can also lead to the creation of closed, proprietary derivative works.</w:t>
+      </w:r>
+    </w:p>
+    <w:p>
+      <w:r>
+        <w:lastRenderedPageBreak/>
+        <w:t>Permissive licenses are often favored by businesses and individuals who want to use open-source software as a component in their own proprietary software, as they provide greater freedom to use the software in their own projects.</w:t>
+      </w:r>
+    </w:p>
     <w:p/>
     <w:sectPr>
       <w:pgSz w:w="12240" w:h="15840"/>

</xml_diff>